<commit_message>
docs: document captioning completion, OCR notebooks, audit and retrieval
- README: experimental retrieval section, repository layout, audit usage.
- data-contracts: OCR contracts for HunyuanOCR-1.5 and PP-OCRv6.
- notebooks/README: OCR notebook operation notes.
- project-status: caption ingested, OCR status, audit findings, retrieval status.
- progress report updated to 24/09/2026.

Co-Authored-By: Claude Opus 5.5 <noreply@anthropic.com>
</commit_message>
<xml_diff>
--- a/docs/reports/Bao_cao_tien_do_do_an_AIC2026.docx
+++ b/docs/reports/Bao_cao_tien_do_do_an_AIC2026.docx
@@ -403,7 +403,7 @@
               <w:rPr>
                 <w:rFonts w:ascii="Times New Roman" w:hAnsi="Times New Roman" w:eastAsia="Times New Roman"/>
               </w:rPr>
-              <w:t>16/09/2026</w:t>
+              <w:t>24/09/2026</w:t>
             </w:r>
           </w:p>
         </w:tc>
@@ -457,7 +457,7 @@
         <w:rPr>
           <w:rFonts w:ascii="Times New Roman" w:hAnsi="Times New Roman" w:eastAsia="Times New Roman"/>
         </w:rPr>
-        <w:t>Đồ án hướng đến xây dựng hệ thống truy xuất video đa phương thức phục vụ bài toán AIC 2026. Đến thời điểm báo cáo, nhóm công việc nền tảng ngoại tuyến đã đạt kết quả rõ ràng: năm nhóm dữ liệu trung gian cốt lõi gồm keyframe, ASR, object detection và hai bộ visual embedding đã được trích xuất hoàn chỉnh, chuẩn hóa cấu trúc và lưu trữ trên Hugging Face. Giai đoạn hiện tại tập trung hoàn thiện OCR, image captioning, kiểm toán liên kết dữ liệu và đánh giá thực nghiệm trước khi chốt kiến trúc truy xuất trực tuyến.</w:t>
+        <w:t>Đồ án hướng đến xây dựng hệ thống truy xuất video đa phương thức phục vụ bài toán AIC 2026. Đến thời điểm báo cáo, sáu nhóm dữ liệu trung gian cốt lõi gồm keyframe, ASR, object detection, image captioning và hai bộ visual embedding đã được trích xuất hoàn chỉnh, chuẩn hóa cấu trúc và lưu trữ trên Hugging Face. Giai đoạn hiện tại tập trung hoàn thiện OCR, kiểm toán liên kết dữ liệu và đánh giá thực nghiệm trước khi chốt kiến trúc truy xuất trực tuyến.</w:t>
       </w:r>
     </w:p>
     <w:tbl>
@@ -1130,7 +1130,7 @@
                 <w:rFonts w:ascii="Times New Roman" w:hAnsi="Times New Roman" w:eastAsia="Times New Roman"/>
                 <w:sz w:val="19"/>
               </w:rPr>
-              <w:t>OCR và caption</w:t>
+              <w:t>Image captioning</w:t>
             </w:r>
           </w:p>
         </w:tc>
@@ -1163,7 +1163,7 @@
                 <w:rFonts w:ascii="Times New Roman" w:hAnsi="Times New Roman" w:eastAsia="Times New Roman"/>
                 <w:sz w:val="19"/>
               </w:rPr>
-              <w:t>Đang nghiên cứu</w:t>
+              <w:t>Hoàn tất</w:t>
             </w:r>
           </w:p>
         </w:tc>
@@ -1196,7 +1196,7 @@
                 <w:rFonts w:ascii="Times New Roman" w:hAnsi="Times New Roman" w:eastAsia="Times New Roman"/>
                 <w:sz w:val="19"/>
               </w:rPr>
-              <w:t>Chưa chốt mô hình và quy trình ingest</w:t>
+              <w:t>BLIP-2 OPT 2.7B COCO; caption tiếng Anh cho mỗi keyframe</w:t>
             </w:r>
           </w:p>
         </w:tc>
@@ -1233,6 +1233,108 @@
                 <w:rFonts w:ascii="Times New Roman" w:hAnsi="Times New Roman" w:eastAsia="Times New Roman"/>
                 <w:sz w:val="19"/>
               </w:rPr>
+              <w:t>OCR</w:t>
+            </w:r>
+          </w:p>
+        </w:tc>
+        <w:tc>
+          <w:tcPr>
+            <w:tcW w:type="dxa" w:w="1701"/>
+            <w:tcBorders>
+              <w:top w:val="single" w:sz="6" w:color="D9E1E8"/>
+              <w:left w:val="single" w:sz="6" w:color="D9E1E8"/>
+              <w:bottom w:val="single" w:sz="6" w:color="D9E1E8"/>
+              <w:right w:val="single" w:sz="6" w:color="D9E1E8"/>
+              <w:insideH w:val="single" w:sz="6" w:color="D9E1E8"/>
+              <w:insideV w:val="single" w:sz="6" w:color="D9E1E8"/>
+            </w:tcBorders>
+            <w:tcMar>
+              <w:top w:w="90" w:type="dxa"/>
+              <w:start w:w="100" w:type="dxa"/>
+              <w:bottom w:w="90" w:type="dxa"/>
+              <w:end w:w="100" w:type="dxa"/>
+            </w:tcMar>
+            <w:vAlign w:val="center"/>
+          </w:tcPr>
+          <w:p>
+            <w:pPr>
+              <w:spacing w:after="0" w:line="252" w:lineRule="auto"/>
+            </w:pPr>
+            <w:r>
+              <w:rPr>
+                <w:rFonts w:ascii="Times New Roman" w:hAnsi="Times New Roman" w:eastAsia="Times New Roman"/>
+                <w:sz w:val="19"/>
+              </w:rPr>
+              <w:t>Đang thử nghiệm</w:t>
+            </w:r>
+          </w:p>
+        </w:tc>
+        <w:tc>
+          <w:tcPr>
+            <w:tcW w:type="dxa" w:w="5159"/>
+            <w:tcBorders>
+              <w:top w:val="single" w:sz="6" w:color="D9E1E8"/>
+              <w:left w:val="single" w:sz="6" w:color="D9E1E8"/>
+              <w:bottom w:val="single" w:sz="6" w:color="D9E1E8"/>
+              <w:right w:val="single" w:sz="6" w:color="D9E1E8"/>
+              <w:insideH w:val="single" w:sz="6" w:color="D9E1E8"/>
+              <w:insideV w:val="single" w:sz="6" w:color="D9E1E8"/>
+            </w:tcBorders>
+            <w:tcMar>
+              <w:top w:w="90" w:type="dxa"/>
+              <w:start w:w="100" w:type="dxa"/>
+              <w:bottom w:w="90" w:type="dxa"/>
+              <w:end w:w="100" w:type="dxa"/>
+            </w:tcMar>
+            <w:vAlign w:val="center"/>
+          </w:tcPr>
+          <w:p>
+            <w:pPr>
+              <w:spacing w:after="0" w:line="252" w:lineRule="auto"/>
+            </w:pPr>
+            <w:r>
+              <w:rPr>
+                <w:rFonts w:ascii="Times New Roman" w:hAnsi="Times New Roman" w:eastAsia="Times New Roman"/>
+                <w:sz w:val="19"/>
+              </w:rPr>
+              <w:t>Qwen3.5-9B; chưa ingest toàn bộ dữ liệu</w:t>
+            </w:r>
+          </w:p>
+        </w:tc>
+      </w:tr>
+      <w:tr>
+        <w:trPr>
+          <w:cantSplit/>
+        </w:trPr>
+        <w:tc>
+          <w:tcPr>
+            <w:tcW w:type="dxa" w:w="2324"/>
+            <w:tcBorders>
+              <w:top w:val="single" w:sz="6" w:color="D9E1E8"/>
+              <w:left w:val="single" w:sz="6" w:color="D9E1E8"/>
+              <w:bottom w:val="single" w:sz="6" w:color="D9E1E8"/>
+              <w:right w:val="single" w:sz="6" w:color="D9E1E8"/>
+              <w:insideH w:val="single" w:sz="6" w:color="D9E1E8"/>
+              <w:insideV w:val="single" w:sz="6" w:color="D9E1E8"/>
+            </w:tcBorders>
+            <w:tcMar>
+              <w:top w:w="90" w:type="dxa"/>
+              <w:start w:w="100" w:type="dxa"/>
+              <w:bottom w:w="90" w:type="dxa"/>
+              <w:end w:w="100" w:type="dxa"/>
+            </w:tcMar>
+            <w:vAlign w:val="center"/>
+            <w:shd w:fill="EEF5FA"/>
+          </w:tcPr>
+          <w:p>
+            <w:pPr>
+              <w:spacing w:after="0" w:line="252" w:lineRule="auto"/>
+            </w:pPr>
+            <w:r>
+              <w:rPr>
+                <w:rFonts w:ascii="Times New Roman" w:hAnsi="Times New Roman" w:eastAsia="Times New Roman"/>
+                <w:sz w:val="19"/>
+              </w:rPr>
               <w:t>Online retrieval</w:t>
             </w:r>
           </w:p>
@@ -1255,6 +1357,7 @@
               <w:end w:w="100" w:type="dxa"/>
             </w:tcMar>
             <w:vAlign w:val="center"/>
+            <w:shd w:fill="EEF5FA"/>
           </w:tcPr>
           <w:p>
             <w:pPr>
@@ -1287,6 +1390,7 @@
               <w:end w:w="100" w:type="dxa"/>
             </w:tcMar>
             <w:vAlign w:val="center"/>
+            <w:shd w:fill="EEF5FA"/>
           </w:tcPr>
           <w:p>
             <w:pPr>
@@ -1524,6 +1628,31 @@
           <w:rFonts w:ascii="Times New Roman" w:hAnsi="Times New Roman" w:eastAsia="Times New Roman"/>
         </w:rPr>
         <w:t>Hai encoder được ingest độc lập để bảo toàn đặc tính mô hình và tạo điều kiện đánh giá từng nhánh trước khi fusion. SigLIP2 có lợi thế mạnh về liên kết văn bản–hình ảnh tổng quát; BEiT-3 Large COCO Retrieval bổ sung biểu diễn đa phương thức được tinh chỉnh cho retrieval. Vector được chuẩn hóa L2 và lưu FP16 để giảm dung lượng nhưng vẫn phù hợp cho tìm kiếm cosine.</w:t>
+      </w:r>
+    </w:p>
+    <w:p>
+      <w:pPr>
+        <w:pStyle w:val="Heading2"/>
+        <w:keepNext/>
+      </w:pPr>
+      <w:r>
+        <w:rPr>
+          <w:rFonts w:ascii="Times New Roman" w:hAnsi="Times New Roman" w:eastAsia="Times New Roman"/>
+        </w:rPr>
+        <w:t>4.5. Sinh mô tả ảnh</w:t>
+      </w:r>
+    </w:p>
+    <w:p>
+      <w:pPr>
+        <w:spacing w:after="100" w:line="300" w:lineRule="auto"/>
+        <w:ind w:firstLine="425"/>
+        <w:jc w:val="both"/>
+      </w:pPr>
+      <w:r>
+        <w:rPr>
+          <w:rFonts w:ascii="Times New Roman" w:hAnsi="Times New Roman" w:eastAsia="Times New Roman"/>
+        </w:rPr>
+        <w:t>Module image captioning sử dụng Salesforce/blip2-opt-2.7b-coco để sinh một caption tiếng Anh cho mỗi keyframe. Quá trình suy luận chạy FP16 trên GPU với beam search xác định gồm ba beam và giới hạn 40 token mới. Pipeline lưu captions.parquet và _CAPTION_SUCCESS.json, kiểm tra số caption khớp số frame, từ chối caption rỗng, lưu revision, hash và provenance, đồng thời hỗ trợ skip/resume dựa trên marker hợp lệ. Toàn bộ dữ liệu caption đã được ingest và lưu trữ trên Hugging Face.</w:t>
       </w:r>
     </w:p>
     <w:tbl>
@@ -2163,12 +2292,111 @@
           </w:p>
         </w:tc>
       </w:tr>
+      <w:tr>
+        <w:trPr>
+          <w:cantSplit/>
+        </w:trPr>
+        <w:tc>
+          <w:tcPr>
+            <w:tcW w:type="dxa" w:w="1361"/>
+            <w:tcBorders>
+              <w:top w:val="single" w:sz="6" w:color="D9E1E8"/>
+              <w:left w:val="single" w:sz="6" w:color="D9E1E8"/>
+              <w:bottom w:val="single" w:sz="6" w:color="D9E1E8"/>
+              <w:right w:val="single" w:sz="6" w:color="D9E1E8"/>
+              <w:insideH w:val="single" w:sz="6" w:color="D9E1E8"/>
+              <w:insideV w:val="single" w:sz="6" w:color="D9E1E8"/>
+            </w:tcBorders>
+            <w:tcMar>
+              <w:top w:w="90" w:type="dxa"/>
+              <w:start w:w="100" w:type="dxa"/>
+              <w:bottom w:w="90" w:type="dxa"/>
+              <w:end w:w="100" w:type="dxa"/>
+            </w:tcMar>
+            <w:vAlign w:val="center"/>
+            <w:shd w:fill="EEF5FA"/>
+          </w:tcPr>
+          <w:p>
+            <w:pPr>
+              <w:spacing w:after="0" w:line="252" w:lineRule="auto"/>
+            </w:pPr>
+            <w:r>
+              <w:rPr>
+                <w:rFonts w:ascii="Times New Roman" w:hAnsi="Times New Roman" w:eastAsia="Times New Roman"/>
+                <w:sz w:val="17"/>
+              </w:rPr>
+              <w:t>Caption</w:t>
+            </w:r>
+          </w:p>
+        </w:tc>
+        <w:tc>
+          <w:tcPr>
+            <w:tcW w:type="dxa" w:w="3458"/>
+            <w:tcBorders>
+              <w:top w:val="single" w:sz="6" w:color="D9E1E8"/>
+              <w:left w:val="single" w:sz="6" w:color="D9E1E8"/>
+              <w:bottom w:val="single" w:sz="6" w:color="D9E1E8"/>
+              <w:right w:val="single" w:sz="6" w:color="D9E1E8"/>
+              <w:insideH w:val="single" w:sz="6" w:color="D9E1E8"/>
+              <w:insideV w:val="single" w:sz="6" w:color="D9E1E8"/>
+            </w:tcBorders>
+            <w:tcMar>
+              <w:top w:w="90" w:type="dxa"/>
+              <w:start w:w="100" w:type="dxa"/>
+              <w:bottom w:w="90" w:type="dxa"/>
+              <w:end w:w="100" w:type="dxa"/>
+            </w:tcMar>
+            <w:vAlign w:val="center"/>
+            <w:shd w:fill="EEF5FA"/>
+          </w:tcPr>
+          <w:p>
+            <w:pPr>
+              <w:spacing w:after="0" w:line="252" w:lineRule="auto"/>
+            </w:pPr>
+            <w:r>
+              <w:rPr>
+                <w:rFonts w:ascii="Times New Roman" w:hAnsi="Times New Roman" w:eastAsia="Times New Roman"/>
+                <w:sz w:val="17"/>
+              </w:rPr>
+              <w:t>Salesforce BLIP-2 OPT 2.7B COCO, FP16</w:t>
+            </w:r>
+          </w:p>
+        </w:tc>
+        <w:tc>
+          <w:tcPr>
+            <w:tcW w:type="dxa" w:w="4365"/>
+            <w:tcBorders>
+              <w:top w:val="single" w:sz="6" w:color="D9E1E8"/>
+              <w:left w:val="single" w:sz="6" w:color="D9E1E8"/>
+              <w:bottom w:val="single" w:sz="6" w:color="D9E1E8"/>
+              <w:right w:val="single" w:sz="6" w:color="D9E1E8"/>
+              <w:insideH w:val="single" w:sz="6" w:color="D9E1E8"/>
+              <w:insideV w:val="single" w:sz="6" w:color="D9E1E8"/>
+            </w:tcBorders>
+            <w:tcMar>
+              <w:top w:w="90" w:type="dxa"/>
+              <w:start w:w="100" w:type="dxa"/>
+              <w:bottom w:w="90" w:type="dxa"/>
+              <w:end w:w="100" w:type="dxa"/>
+            </w:tcMar>
+            <w:vAlign w:val="center"/>
+            <w:shd w:fill="EEF5FA"/>
+          </w:tcPr>
+          <w:p>
+            <w:pPr>
+              <w:spacing w:after="0" w:line="252" w:lineRule="auto"/>
+            </w:pPr>
+            <w:r>
+              <w:rPr>
+                <w:rFonts w:ascii="Times New Roman" w:hAnsi="Times New Roman" w:eastAsia="Times New Roman"/>
+                <w:sz w:val="17"/>
+              </w:rPr>
+              <w:t>aqpahm/aic2026-caption-blip2-opt-2.7b-coco (private)</w:t>
+            </w:r>
+          </w:p>
+        </w:tc>
+      </w:tr>
     </w:tbl>
-    <w:p>
-      <w:pPr>
-        <w:spacing w:after="0"/>
-      </w:pPr>
-    </w:p>
     <w:p>
       <w:r>
         <w:rPr>
@@ -2866,6 +3094,107 @@
                 <w:sz w:val="18"/>
               </w:rPr>
               <w:t>frame_uid, vector FP16 chuẩn hóa L2, model metadata</w:t>
+            </w:r>
+          </w:p>
+        </w:tc>
+      </w:tr>
+      <w:tr>
+        <w:trPr>
+          <w:cantSplit/>
+        </w:trPr>
+        <w:tc>
+          <w:tcPr>
+            <w:tcW w:type="dxa" w:w="1417"/>
+            <w:tcBorders>
+              <w:top w:val="single" w:sz="6" w:color="D9E1E8"/>
+              <w:left w:val="single" w:sz="6" w:color="D9E1E8"/>
+              <w:bottom w:val="single" w:sz="6" w:color="D9E1E8"/>
+              <w:right w:val="single" w:sz="6" w:color="D9E1E8"/>
+              <w:insideH w:val="single" w:sz="6" w:color="D9E1E8"/>
+              <w:insideV w:val="single" w:sz="6" w:color="D9E1E8"/>
+            </w:tcBorders>
+            <w:tcMar>
+              <w:top w:w="90" w:type="dxa"/>
+              <w:start w:w="100" w:type="dxa"/>
+              <w:bottom w:w="90" w:type="dxa"/>
+              <w:end w:w="100" w:type="dxa"/>
+            </w:tcMar>
+            <w:vAlign w:val="center"/>
+          </w:tcPr>
+          <w:p>
+            <w:pPr>
+              <w:spacing w:after="0" w:line="252" w:lineRule="auto"/>
+            </w:pPr>
+            <w:r>
+              <w:rPr>
+                <w:rFonts w:ascii="Times New Roman" w:hAnsi="Times New Roman" w:eastAsia="Times New Roman"/>
+                <w:sz w:val="18"/>
+              </w:rPr>
+              <w:t>Caption</w:t>
+            </w:r>
+          </w:p>
+        </w:tc>
+        <w:tc>
+          <w:tcPr>
+            <w:tcW w:type="dxa" w:w="3005"/>
+            <w:tcBorders>
+              <w:top w:val="single" w:sz="6" w:color="D9E1E8"/>
+              <w:left w:val="single" w:sz="6" w:color="D9E1E8"/>
+              <w:bottom w:val="single" w:sz="6" w:color="D9E1E8"/>
+              <w:right w:val="single" w:sz="6" w:color="D9E1E8"/>
+              <w:insideH w:val="single" w:sz="6" w:color="D9E1E8"/>
+              <w:insideV w:val="single" w:sz="6" w:color="D9E1E8"/>
+            </w:tcBorders>
+            <w:tcMar>
+              <w:top w:w="90" w:type="dxa"/>
+              <w:start w:w="100" w:type="dxa"/>
+              <w:bottom w:w="90" w:type="dxa"/>
+              <w:end w:w="100" w:type="dxa"/>
+            </w:tcMar>
+            <w:vAlign w:val="center"/>
+          </w:tcPr>
+          <w:p>
+            <w:pPr>
+              <w:spacing w:after="0" w:line="252" w:lineRule="auto"/>
+            </w:pPr>
+            <w:r>
+              <w:rPr>
+                <w:rFonts w:ascii="Times New Roman" w:hAnsi="Times New Roman" w:eastAsia="Times New Roman"/>
+                <w:sz w:val="18"/>
+              </w:rPr>
+              <w:t>captions.parquet</w:t>
+            </w:r>
+          </w:p>
+        </w:tc>
+        <w:tc>
+          <w:tcPr>
+            <w:tcW w:type="dxa" w:w="4762"/>
+            <w:tcBorders>
+              <w:top w:val="single" w:sz="6" w:color="D9E1E8"/>
+              <w:left w:val="single" w:sz="6" w:color="D9E1E8"/>
+              <w:bottom w:val="single" w:sz="6" w:color="D9E1E8"/>
+              <w:right w:val="single" w:sz="6" w:color="D9E1E8"/>
+              <w:insideH w:val="single" w:sz="6" w:color="D9E1E8"/>
+              <w:insideV w:val="single" w:sz="6" w:color="D9E1E8"/>
+            </w:tcBorders>
+            <w:tcMar>
+              <w:top w:w="90" w:type="dxa"/>
+              <w:start w:w="100" w:type="dxa"/>
+              <w:bottom w:w="90" w:type="dxa"/>
+              <w:end w:w="100" w:type="dxa"/>
+            </w:tcMar>
+            <w:vAlign w:val="center"/>
+          </w:tcPr>
+          <w:p>
+            <w:pPr>
+              <w:spacing w:after="0" w:line="252" w:lineRule="auto"/>
+            </w:pPr>
+            <w:r>
+              <w:rPr>
+                <w:rFonts w:ascii="Times New Roman" w:hAnsi="Times New Roman" w:eastAsia="Times New Roman"/>
+                <w:sz w:val="18"/>
+              </w:rPr>
+              <w:t>frame_uid, timestamp, caption tiếng Anh, model/revision metadata</w:t>
             </w:r>
           </w:p>
         </w:tc>
@@ -4125,7 +4454,7 @@
         <w:rPr>
           <w:rFonts w:ascii="Times New Roman" w:hAnsi="Times New Roman" w:eastAsia="Times New Roman"/>
         </w:rPr>
-        <w:t>Chọn và ingest image captioning; đánh giá khả năng mô tả sự kiện, hành động, bối cảnh và quan hệ giữa các đối tượng.</w:t>
+        <w:t>Đánh giá chất lượng caption đã ingest theo nhóm cảnh; kiểm tra mức độ mô tả đúng sự kiện, hành động, bối cảnh, quan hệ giữa các đối tượng và hiện tượng hallucination.</w:t>
       </w:r>
     </w:p>
     <w:p>
@@ -4137,7 +4466,7 @@
         <w:rPr>
           <w:rFonts w:ascii="Times New Roman" w:hAnsi="Times New Roman" w:eastAsia="Times New Roman"/>
         </w:rPr>
-        <w:t>Thực hiện cross-module audit để kiểm tra khóa join, timestamp, số lượng frame và coverage giữa keyframe, ASR, OD và hai visual embedding.</w:t>
+        <w:t>Thực hiện cross-module audit để kiểm tra khóa join, timestamp, số lượng frame và coverage giữa keyframe, ASR, OD, caption và hai visual embedding.</w:t>
       </w:r>
     </w:p>
     <w:p>
@@ -4386,7 +4715,7 @@
                 <w:rFonts w:ascii="Times New Roman" w:hAnsi="Times New Roman" w:eastAsia="Times New Roman"/>
                 <w:sz w:val="18"/>
               </w:rPr>
-              <w:t>OCR, caption, audit liên module</w:t>
+              <w:t>OCR, đánh giá chất lượng caption, audit liên module</w:t>
             </w:r>
           </w:p>
         </w:tc>
@@ -4972,7 +5301,7 @@
                 <w:rFonts w:ascii="Times New Roman" w:hAnsi="Times New Roman" w:eastAsia="Times New Roman"/>
                 <w:sz w:val="18"/>
               </w:rPr>
-              <w:t>OCR/caption tạo nhiễu trên cảnh khó</w:t>
+              <w:t>OCR hoặc caption tạo nhiễu trên cảnh khó</w:t>
             </w:r>
           </w:p>
         </w:tc>
@@ -5377,7 +5706,7 @@
         <w:rPr>
           <w:rFonts w:ascii="Times New Roman" w:hAnsi="Times New Roman" w:eastAsia="Times New Roman"/>
         </w:rPr>
-        <w:t>Tiến độ hiện tại đã hoàn thành phần nền dữ liệu quan trọng cho hệ thống: keyframe, ASR, OD và hai nhánh visual embedding đều có artifact độc lập, có khả năng resume và được lưu trữ tập trung. Công việc kế tiếp cần chuyển từ ingest sang kiểm toán, xây dựng validation set và thực nghiệm kiến trúc. Cách tiếp cận này giúp quyết định fusion, reranking và hạ tầng dựa trên số liệu thay vì chọn theo cảm tính, đồng thời hạn chế phải xử lý lại toàn bộ dữ liệu khi thay đổi kiến trúc online.</w:t>
+        <w:t>Tiến độ hiện tại đã hoàn thành phần nền dữ liệu quan trọng cho hệ thống: keyframe, ASR, OD, image captioning và hai nhánh visual embedding đều có artifact độc lập, có khả năng resume và được lưu trữ tập trung. Công việc kế tiếp là hoàn thiện OCR, kiểm toán liên module, xây dựng validation set và thực nghiệm kiến trúc. Cách tiếp cận này giúp quyết định fusion, reranking và hạ tầng dựa trên số liệu thay vì chọn theo cảm tính, đồng thời hạn chế phải xử lý lại toàn bộ dữ liệu khi thay đổi kiến trúc online.</w:t>
       </w:r>
     </w:p>
     <w:p>

</xml_diff>